<commit_message>
update the deployment Files
</commit_message>
<xml_diff>
--- a/docs/03_Manual_Guide.docx
+++ b/docs/03_Manual_Guide.docx
@@ -145,7 +145,7 @@
                 <w:color w:val="111111"/>
                 <w:sz w:val="20"/>
               </w:rPr>
-              <w:t>1.3</w:t>
+              <w:t>1.4</w:t>
             </w:r>
           </w:p>
         </w:tc>
@@ -181,7 +181,7 @@
                 <w:color w:val="111111"/>
                 <w:sz w:val="20"/>
               </w:rPr>
-              <w:t>2026-09-03</w:t>
+              <w:t>2026-09-05</w:t>
             </w:r>
           </w:p>
         </w:tc>
@@ -1193,15 +1193,6 @@
     <w:p>
       <w:r>
         <w:rPr>
-          <w:rFonts w:ascii="Calibri" w:hAnsi="Calibri"/>
-          <w:b w:val="0"/>
-          <w:color w:val="111111"/>
-          <w:sz w:val="22"/>
-        </w:rPr>
-        <w:t xml:space="preserve">Create </w:t>
-      </w:r>
-      <w:r>
-        <w:rPr>
           <w:rFonts w:ascii="Consolas" w:hAnsi="Consolas"/>
           <w:color w:val="333333"/>
           <w:sz w:val="20"/>
@@ -1215,7 +1206,100 @@
           <w:color w:val="111111"/>
           <w:sz w:val="22"/>
         </w:rPr>
-        <w:t>:</w:t>
+        <w:t xml:space="preserve"> is </w:t>
+      </w:r>
+      <w:r>
+        <w:rPr>
+          <w:rFonts w:ascii="Calibri" w:hAnsi="Calibri"/>
+          <w:b/>
+          <w:color w:val="111111"/>
+          <w:sz w:val="22"/>
+        </w:rPr>
+        <w:t>optional</w:t>
+      </w:r>
+      <w:r>
+        <w:rPr>
+          <w:rFonts w:ascii="Calibri" w:hAnsi="Calibri"/>
+          <w:b w:val="0"/>
+          <w:color w:val="111111"/>
+          <w:sz w:val="22"/>
+        </w:rPr>
+        <w:t xml:space="preserve"> — leave </w:t>
+      </w:r>
+      <w:r>
+        <w:rPr>
+          <w:rFonts w:ascii="Consolas" w:hAnsi="Consolas"/>
+          <w:color w:val="333333"/>
+          <w:sz w:val="20"/>
+        </w:rPr>
+        <w:t>VITE_API_URL</w:t>
+      </w:r>
+      <w:r>
+        <w:rPr>
+          <w:rFonts w:ascii="Calibri" w:hAnsi="Calibri"/>
+          <w:b w:val="0"/>
+          <w:color w:val="111111"/>
+          <w:sz w:val="22"/>
+        </w:rPr>
+        <w:t xml:space="preserve"> unset. The SPA defaults to</w:t>
+      </w:r>
+    </w:p>
+    <w:p>
+      <w:r>
+        <w:rPr>
+          <w:rFonts w:ascii="Calibri" w:hAnsi="Calibri"/>
+          <w:b w:val="0"/>
+          <w:color w:val="111111"/>
+          <w:sz w:val="22"/>
+        </w:rPr>
+        <w:t xml:space="preserve">the same-origin relative path </w:t>
+      </w:r>
+      <w:r>
+        <w:rPr>
+          <w:rFonts w:ascii="Consolas" w:hAnsi="Consolas"/>
+          <w:color w:val="333333"/>
+          <w:sz w:val="20"/>
+        </w:rPr>
+        <w:t>/api/v1</w:t>
+      </w:r>
+      <w:r>
+        <w:rPr>
+          <w:rFonts w:ascii="Calibri" w:hAnsi="Calibri"/>
+          <w:b w:val="0"/>
+          <w:color w:val="111111"/>
+          <w:sz w:val="22"/>
+        </w:rPr>
+        <w:t>, which the Vite dev proxy forwards to</w:t>
+      </w:r>
+    </w:p>
+    <w:p>
+      <w:r>
+        <w:rPr>
+          <w:rFonts w:ascii="Consolas" w:hAnsi="Consolas"/>
+          <w:color w:val="333333"/>
+          <w:sz w:val="20"/>
+        </w:rPr>
+        <w:t>http://localhost:5000</w:t>
+      </w:r>
+      <w:r>
+        <w:rPr>
+          <w:rFonts w:ascii="Calibri" w:hAnsi="Calibri"/>
+          <w:b w:val="0"/>
+          <w:color w:val="111111"/>
+          <w:sz w:val="22"/>
+        </w:rPr>
+        <w:t xml:space="preserve"> in development and the Vercel rewrite forwards to the</w:t>
+      </w:r>
+    </w:p>
+    <w:p>
+      <w:r>
+        <w:rPr>
+          <w:rFonts w:ascii="Calibri" w:hAnsi="Calibri"/>
+          <w:b w:val="0"/>
+          <w:color w:val="111111"/>
+          <w:sz w:val="22"/>
+        </w:rPr>
+        <w:t>serverless function in production, so one default works in both.</w:t>
       </w:r>
     </w:p>
     <w:p>
@@ -1228,7 +1312,297 @@
           <w:color w:val="222222"/>
           <w:sz w:val="19"/>
         </w:rPr>
-        <w:t>VITE_API_URL=http://localhost:5000/api/v1</w:t>
+        <w:t># client/.env — only needed for a split-origin setup</w:t>
+        <w:br/>
+        <w:t># VITE_API_URL=https://api.your-domain.com/api/v1</w:t>
+      </w:r>
+    </w:p>
+    <w:p>
+      <w:pPr>
+        <w:ind w:left="432"/>
+      </w:pPr>
+      <w:r>
+        <w:rPr>
+          <w:rFonts w:ascii="Calibri" w:hAnsi="Calibri"/>
+          <w:b/>
+          <w:i/>
+          <w:color w:val="555555"/>
+          <w:sz w:val="22"/>
+        </w:rPr>
+        <w:t>Do not set `VITE_API_URL=http://localhost:5000/api/v1`.</w:t>
+      </w:r>
+      <w:r>
+        <w:rPr>
+          <w:rFonts w:ascii="Calibri" w:hAnsi="Calibri"/>
+          <w:b w:val="0"/>
+          <w:i/>
+          <w:color w:val="555555"/>
+          <w:sz w:val="22"/>
+        </w:rPr>
+        <w:t xml:space="preserve"> Vite inlines</w:t>
+      </w:r>
+    </w:p>
+    <w:p>
+      <w:pPr>
+        <w:ind w:left="432"/>
+      </w:pPr>
+      <w:r>
+        <w:rPr>
+          <w:rFonts w:ascii="Consolas" w:hAnsi="Consolas"/>
+          <w:i/>
+          <w:color w:val="333333"/>
+          <w:sz w:val="20"/>
+        </w:rPr>
+        <w:t>VITE_*</w:t>
+      </w:r>
+      <w:r>
+        <w:rPr>
+          <w:rFonts w:ascii="Calibri" w:hAnsi="Calibri"/>
+          <w:b w:val="0"/>
+          <w:i/>
+          <w:color w:val="555555"/>
+          <w:sz w:val="22"/>
+        </w:rPr>
+        <w:t xml:space="preserve"> values into the bundle at build time, so that string ships to</w:t>
+      </w:r>
+    </w:p>
+    <w:p>
+      <w:pPr>
+        <w:ind w:left="432"/>
+      </w:pPr>
+      <w:r>
+        <w:rPr>
+          <w:rFonts w:ascii="Calibri" w:hAnsi="Calibri"/>
+          <w:b w:val="0"/>
+          <w:i/>
+          <w:color w:val="555555"/>
+          <w:sz w:val="22"/>
+        </w:rPr>
+        <w:t xml:space="preserve">production and makes the deployed SPA call </w:t>
+      </w:r>
+      <w:r>
+        <w:rPr>
+          <w:rFonts w:ascii="Calibri" w:hAnsi="Calibri"/>
+          <w:b/>
+          <w:i/>
+          <w:color w:val="555555"/>
+          <w:sz w:val="22"/>
+        </w:rPr>
+        <w:t>each visitor's own machine</w:t>
+      </w:r>
+      <w:r>
+        <w:rPr>
+          <w:rFonts w:ascii="Calibri" w:hAnsi="Calibri"/>
+          <w:b w:val="0"/>
+          <w:i/>
+          <w:color w:val="555555"/>
+          <w:sz w:val="22"/>
+        </w:rPr>
+        <w:t>.</w:t>
+      </w:r>
+    </w:p>
+    <w:p>
+      <w:pPr>
+        <w:ind w:left="432"/>
+      </w:pPr>
+      <w:r>
+        <w:rPr>
+          <w:rFonts w:ascii="Calibri" w:hAnsi="Calibri"/>
+          <w:b w:val="0"/>
+          <w:i/>
+          <w:color w:val="555555"/>
+          <w:sz w:val="22"/>
+        </w:rPr>
+        <w:t>It appears to work locally, which is exactly why it goes unnoticed.</w:t>
+      </w:r>
+    </w:p>
+    <w:p>
+      <w:pPr>
+        <w:ind w:left="432"/>
+      </w:pPr>
+    </w:p>
+    <w:p>
+      <w:pPr>
+        <w:ind w:left="432"/>
+      </w:pPr>
+      <w:r>
+        <w:rPr>
+          <w:rFonts w:ascii="Calibri" w:hAnsi="Calibri"/>
+          <w:b w:val="0"/>
+          <w:i/>
+          <w:color w:val="555555"/>
+          <w:sz w:val="22"/>
+        </w:rPr>
+        <w:t xml:space="preserve">The dev proxy target reads </w:t>
+      </w:r>
+      <w:r>
+        <w:rPr>
+          <w:rFonts w:ascii="Consolas" w:hAnsi="Consolas"/>
+          <w:i/>
+          <w:color w:val="333333"/>
+          <w:sz w:val="20"/>
+        </w:rPr>
+        <w:t>BACKEND_URL</w:t>
+      </w:r>
+      <w:r>
+        <w:rPr>
+          <w:rFonts w:ascii="Calibri" w:hAnsi="Calibri"/>
+          <w:b w:val="0"/>
+          <w:i/>
+          <w:color w:val="555555"/>
+          <w:sz w:val="22"/>
+        </w:rPr>
+        <w:t xml:space="preserve"> from the </w:t>
+      </w:r>
+      <w:r>
+        <w:rPr>
+          <w:rFonts w:ascii="Calibri" w:hAnsi="Calibri"/>
+          <w:b/>
+          <w:i/>
+          <w:color w:val="555555"/>
+          <w:sz w:val="22"/>
+        </w:rPr>
+        <w:t>shell</w:t>
+      </w:r>
+      <w:r>
+        <w:rPr>
+          <w:rFonts w:ascii="Calibri" w:hAnsi="Calibri"/>
+          <w:b w:val="0"/>
+          <w:i/>
+          <w:color w:val="555555"/>
+          <w:sz w:val="22"/>
+        </w:rPr>
+        <w:t xml:space="preserve"> environment</w:t>
+      </w:r>
+    </w:p>
+    <w:p>
+      <w:pPr>
+        <w:ind w:left="432"/>
+      </w:pPr>
+      <w:r>
+        <w:rPr>
+          <w:rFonts w:ascii="Calibri" w:hAnsi="Calibri"/>
+          <w:b w:val="0"/>
+          <w:i/>
+          <w:color w:val="555555"/>
+          <w:sz w:val="22"/>
+        </w:rPr>
+        <w:t>(</w:t>
+      </w:r>
+      <w:r>
+        <w:rPr>
+          <w:rFonts w:ascii="Consolas" w:hAnsi="Consolas"/>
+          <w:i/>
+          <w:color w:val="333333"/>
+          <w:sz w:val="20"/>
+        </w:rPr>
+        <w:t>BACKEND_URL=http://localhost:5000 npm run dev:client</w:t>
+      </w:r>
+      <w:r>
+        <w:rPr>
+          <w:rFonts w:ascii="Calibri" w:hAnsi="Calibri"/>
+          <w:b w:val="0"/>
+          <w:i/>
+          <w:color w:val="555555"/>
+          <w:sz w:val="22"/>
+        </w:rPr>
+        <w:t>) and defaults to</w:t>
+      </w:r>
+    </w:p>
+    <w:p>
+      <w:pPr>
+        <w:ind w:left="432"/>
+      </w:pPr>
+      <w:r>
+        <w:rPr>
+          <w:rFonts w:ascii="Consolas" w:hAnsi="Consolas"/>
+          <w:i/>
+          <w:color w:val="333333"/>
+          <w:sz w:val="20"/>
+        </w:rPr>
+        <w:t>http://localhost:5000</w:t>
+      </w:r>
+      <w:r>
+        <w:rPr>
+          <w:rFonts w:ascii="Calibri" w:hAnsi="Calibri"/>
+          <w:b w:val="0"/>
+          <w:i/>
+          <w:color w:val="555555"/>
+          <w:sz w:val="22"/>
+        </w:rPr>
+        <w:t xml:space="preserve">. Vite never loads </w:t>
+      </w:r>
+      <w:r>
+        <w:rPr>
+          <w:rFonts w:ascii="Consolas" w:hAnsi="Consolas"/>
+          <w:i/>
+          <w:color w:val="333333"/>
+          <w:sz w:val="20"/>
+        </w:rPr>
+        <w:t>server/.env</w:t>
+      </w:r>
+      <w:r>
+        <w:rPr>
+          <w:rFonts w:ascii="Calibri" w:hAnsi="Calibri"/>
+          <w:b w:val="0"/>
+          <w:i/>
+          <w:color w:val="555555"/>
+          <w:sz w:val="22"/>
+        </w:rPr>
+        <w:t>, so a variable</w:t>
+      </w:r>
+    </w:p>
+    <w:p>
+      <w:pPr>
+        <w:ind w:left="432"/>
+      </w:pPr>
+      <w:r>
+        <w:rPr>
+          <w:rFonts w:ascii="Calibri" w:hAnsi="Calibri"/>
+          <w:b w:val="0"/>
+          <w:i/>
+          <w:color w:val="555555"/>
+          <w:sz w:val="22"/>
+        </w:rPr>
+        <w:t xml:space="preserve">defined only there is </w:t>
+      </w:r>
+      <w:r>
+        <w:rPr>
+          <w:rFonts w:ascii="Consolas" w:hAnsi="Consolas"/>
+          <w:i/>
+          <w:color w:val="333333"/>
+          <w:sz w:val="20"/>
+        </w:rPr>
+        <w:t>undefined</w:t>
+      </w:r>
+      <w:r>
+        <w:rPr>
+          <w:rFonts w:ascii="Calibri" w:hAnsi="Calibri"/>
+          <w:b w:val="0"/>
+          <w:i/>
+          <w:color w:val="555555"/>
+          <w:sz w:val="22"/>
+        </w:rPr>
+        <w:t xml:space="preserve"> in </w:t>
+      </w:r>
+      <w:r>
+        <w:rPr>
+          <w:rFonts w:ascii="Consolas" w:hAnsi="Consolas"/>
+          <w:i/>
+          <w:color w:val="333333"/>
+          <w:sz w:val="20"/>
+        </w:rPr>
+        <w:t>vite.config.ts</w:t>
+      </w:r>
+      <w:r>
+        <w:rPr>
+          <w:rFonts w:ascii="Calibri" w:hAnsi="Calibri"/>
+          <w:b w:val="0"/>
+          <w:i/>
+          <w:color w:val="555555"/>
+          <w:sz w:val="22"/>
+        </w:rPr>
+        <w:t>.</w:t>
       </w:r>
     </w:p>
     <w:p>

</xml_diff>